<commit_message>
eight jul three pm
</commit_message>
<xml_diff>
--- a/ASYLUM_NEW_COMER_Template_NEW.docx
+++ b/ASYLUM_NEW_COMER_Template_NEW.docx
@@ -38,8 +38,6 @@
           <w:b/>
         </w:rPr>
       </w:pPr>
-      <w:bookmarkStart w:id="0" w:name="_GoBack"/>
-      <w:bookmarkEnd w:id="0"/>
       <w:r>
         <w:rPr>
           <w:b/>
@@ -402,30 +400,12 @@
         <w:tabs>
           <w:tab w:val="left" w:pos="10206"/>
         </w:tabs>
-        <w:spacing w:after="160"/>
-        <w:ind w:right="652"/>
-      </w:pPr>
-    </w:p>
-    <w:p>
-      <w:pPr>
-        <w:tabs>
-          <w:tab w:val="left" w:pos="10206"/>
-        </w:tabs>
         <w:spacing w:after="120"/>
         <w:ind w:right="652"/>
       </w:pPr>
       <w:r>
         <w:t>Dear Sir / Madam,</w:t>
       </w:r>
-    </w:p>
-    <w:p>
-      <w:pPr>
-        <w:tabs>
-          <w:tab w:val="left" w:pos="10206"/>
-        </w:tabs>
-        <w:spacing w:after="80"/>
-        <w:ind w:right="652"/>
-      </w:pPr>
     </w:p>
     <w:p>
       <w:pPr>
@@ -656,7 +636,6 @@
                 <w:sz w:val="21"/>
                 <w:szCs w:val="21"/>
               </w:rPr>
-              <w:lastRenderedPageBreak/>
               <w:t>NO SUSPENSION of the invalidity was granted. These provisions are invalid NOW — from 7 July 2026.</w:t>
             </w:r>
           </w:p>
@@ -670,6 +649,20 @@
         </w:tabs>
         <w:spacing w:after="160"/>
         <w:ind w:right="652"/>
+      </w:pPr>
+    </w:p>
+    <w:p>
+      <w:pPr>
+        <w:tabs>
+          <w:tab w:val="left" w:pos="10206"/>
+        </w:tabs>
+        <w:spacing w:before="200" w:after="100"/>
+        <w:ind w:right="652"/>
+        <w:rPr>
+          <w:b/>
+          <w:bCs/>
+          <w:color w:val="1B2A4A"/>
+        </w:rPr>
       </w:pPr>
     </w:p>
     <w:p>
@@ -1073,9 +1066,17 @@
           <w:sz w:val="21"/>
           <w:szCs w:val="21"/>
         </w:rPr>
-        <w:lastRenderedPageBreak/>
         <w:t>The provisions caused severe harm to children, whose asylum claims were automatically denied if a parent failed a procedural requirement, without any individual assessment of the child’s own circumstances.</w:t>
       </w:r>
+    </w:p>
+    <w:p>
+      <w:pPr>
+        <w:tabs>
+          <w:tab w:val="left" w:pos="10206"/>
+        </w:tabs>
+        <w:spacing w:after="80"/>
+        <w:ind w:right="652"/>
+      </w:pPr>
     </w:p>
     <w:p>
       <w:pPr>
@@ -1523,15 +1524,42 @@
         </w:tabs>
         <w:spacing w:before="200" w:after="100"/>
         <w:ind w:right="652"/>
-      </w:pPr>
-      <w:proofErr w:type="gramStart"/>
-      <w:r>
         <w:rPr>
           <w:b/>
           <w:bCs/>
           <w:color w:val="1B2A4A"/>
         </w:rPr>
-        <w:lastRenderedPageBreak/>
+      </w:pPr>
+    </w:p>
+    <w:p>
+      <w:pPr>
+        <w:tabs>
+          <w:tab w:val="left" w:pos="10206"/>
+        </w:tabs>
+        <w:spacing w:before="200" w:after="100"/>
+        <w:ind w:right="652"/>
+        <w:rPr>
+          <w:b/>
+          <w:bCs/>
+          <w:color w:val="1B2A4A"/>
+        </w:rPr>
+      </w:pPr>
+    </w:p>
+    <w:p>
+      <w:pPr>
+        <w:tabs>
+          <w:tab w:val="left" w:pos="10206"/>
+        </w:tabs>
+        <w:spacing w:before="200" w:after="100"/>
+        <w:ind w:right="652"/>
+      </w:pPr>
+      <w:proofErr w:type="gramStart"/>
+      <w:r>
+        <w:rPr>
+          <w:b/>
+          <w:bCs/>
+          <w:color w:val="1B2A4A"/>
+        </w:rPr>
         <w:t>4.1  Statutory</w:t>
       </w:r>
       <w:proofErr w:type="gramEnd"/>
@@ -2033,7 +2061,6 @@
           <w:bCs/>
           <w:color w:val="1B2A4A"/>
         </w:rPr>
-        <w:lastRenderedPageBreak/>
         <w:t>4.4  The</w:t>
       </w:r>
       <w:proofErr w:type="gramEnd"/>
@@ -2630,6 +2657,48 @@
         </w:tabs>
         <w:spacing w:before="200" w:after="100"/>
         <w:ind w:right="652"/>
+        <w:rPr>
+          <w:b/>
+          <w:bCs/>
+          <w:color w:val="1B2A4A"/>
+        </w:rPr>
+      </w:pPr>
+    </w:p>
+    <w:p>
+      <w:pPr>
+        <w:tabs>
+          <w:tab w:val="left" w:pos="10206"/>
+        </w:tabs>
+        <w:spacing w:before="200" w:after="100"/>
+        <w:ind w:right="652"/>
+        <w:rPr>
+          <w:b/>
+          <w:bCs/>
+          <w:color w:val="1B2A4A"/>
+        </w:rPr>
+      </w:pPr>
+    </w:p>
+    <w:p>
+      <w:pPr>
+        <w:tabs>
+          <w:tab w:val="left" w:pos="10206"/>
+        </w:tabs>
+        <w:spacing w:before="200" w:after="100"/>
+        <w:ind w:right="652"/>
+        <w:rPr>
+          <w:b/>
+          <w:bCs/>
+          <w:color w:val="1B2A4A"/>
+        </w:rPr>
+      </w:pPr>
+    </w:p>
+    <w:p>
+      <w:pPr>
+        <w:tabs>
+          <w:tab w:val="left" w:pos="10206"/>
+        </w:tabs>
+        <w:spacing w:before="200" w:after="100"/>
+        <w:ind w:right="652"/>
       </w:pPr>
       <w:proofErr w:type="gramStart"/>
       <w:r>
@@ -2717,7 +2786,6 @@
                 <w:sz w:val="20"/>
                 <w:szCs w:val="20"/>
               </w:rPr>
-              <w:lastRenderedPageBreak/>
               <w:t>Ruta</w:t>
             </w:r>
             <w:proofErr w:type="spellEnd"/>
@@ -3084,6 +3152,74 @@
         </w:tabs>
         <w:spacing w:before="280" w:after="120"/>
         <w:ind w:right="652"/>
+        <w:rPr>
+          <w:b/>
+          <w:bCs/>
+          <w:color w:val="1B2A4A"/>
+          <w:sz w:val="24"/>
+          <w:szCs w:val="24"/>
+          <w:u w:val="single"/>
+        </w:rPr>
+      </w:pPr>
+    </w:p>
+    <w:p>
+      <w:pPr>
+        <w:tabs>
+          <w:tab w:val="left" w:pos="10206"/>
+        </w:tabs>
+        <w:spacing w:before="280" w:after="120"/>
+        <w:ind w:right="652"/>
+        <w:rPr>
+          <w:b/>
+          <w:bCs/>
+          <w:color w:val="1B2A4A"/>
+          <w:sz w:val="24"/>
+          <w:szCs w:val="24"/>
+          <w:u w:val="single"/>
+        </w:rPr>
+      </w:pPr>
+    </w:p>
+    <w:p>
+      <w:pPr>
+        <w:tabs>
+          <w:tab w:val="left" w:pos="10206"/>
+        </w:tabs>
+        <w:spacing w:before="280" w:after="120"/>
+        <w:ind w:right="652"/>
+        <w:rPr>
+          <w:b/>
+          <w:bCs/>
+          <w:color w:val="1B2A4A"/>
+          <w:sz w:val="24"/>
+          <w:szCs w:val="24"/>
+          <w:u w:val="single"/>
+        </w:rPr>
+      </w:pPr>
+    </w:p>
+    <w:p>
+      <w:pPr>
+        <w:tabs>
+          <w:tab w:val="left" w:pos="10206"/>
+        </w:tabs>
+        <w:spacing w:before="280" w:after="120"/>
+        <w:ind w:right="652"/>
+        <w:rPr>
+          <w:b/>
+          <w:bCs/>
+          <w:color w:val="1B2A4A"/>
+          <w:sz w:val="24"/>
+          <w:szCs w:val="24"/>
+          <w:u w:val="single"/>
+        </w:rPr>
+      </w:pPr>
+    </w:p>
+    <w:p>
+      <w:pPr>
+        <w:tabs>
+          <w:tab w:val="left" w:pos="10206"/>
+        </w:tabs>
+        <w:spacing w:before="280" w:after="120"/>
+        <w:ind w:right="652"/>
       </w:pPr>
       <w:r>
         <w:rPr>
@@ -3233,16 +3369,7 @@
                 <w:sz w:val="21"/>
                 <w:szCs w:val="21"/>
               </w:rPr>
-              <w:t xml:space="preserve">They are therefore LAWFULLY PRESENT in the Republic of South Africa until their </w:t>
-            </w:r>
-            <w:r>
-              <w:rPr>
-                <w:color w:val="1A1A1A"/>
-                <w:sz w:val="21"/>
-                <w:szCs w:val="21"/>
-              </w:rPr>
-              <w:lastRenderedPageBreak/>
-              <w:t>application is finally determined.</w:t>
+              <w:t>They are therefore LAWFULLY PRESENT in the Republic of South Africa until their application is finally determined.</w:t>
             </w:r>
           </w:p>
           <w:p>
@@ -3768,7 +3895,15 @@
                 <w:sz w:val="18"/>
                 <w:szCs w:val="18"/>
               </w:rPr>
-              <w:t xml:space="preserve"> v Minister of Home Affairs (CCT/25022, June 2023)</w:t>
+              <w:t xml:space="preserve"> v Minister of Home Affairs (CCT/25022, June </w:t>
+            </w:r>
+            <w:r>
+              <w:rPr>
+                <w:sz w:val="18"/>
+                <w:szCs w:val="18"/>
+              </w:rPr>
+              <w:lastRenderedPageBreak/>
+              <w:t>2023)</w:t>
             </w:r>
           </w:p>
         </w:tc>
@@ -3801,7 +3936,16 @@
                 <w:sz w:val="18"/>
                 <w:szCs w:val="18"/>
               </w:rPr>
-              <w:t>Protection is triggered by the intention to apply for asylum, not by holding a permit. Illegal foreigner must be released from detention the moment asylum intention is expressed.</w:t>
+              <w:lastRenderedPageBreak/>
+              <w:t xml:space="preserve">Protection is triggered by the intention to apply for asylum, not by holding a permit. Illegal foreigner must be released from </w:t>
+            </w:r>
+            <w:r>
+              <w:rPr>
+                <w:sz w:val="18"/>
+                <w:szCs w:val="18"/>
+              </w:rPr>
+              <w:lastRenderedPageBreak/>
+              <w:t>detention the moment asylum intention is expressed.</w:t>
             </w:r>
           </w:p>
         </w:tc>
@@ -3839,6 +3983,7 @@
                 <w:sz w:val="18"/>
                 <w:szCs w:val="18"/>
               </w:rPr>
+              <w:lastRenderedPageBreak/>
               <w:t>Ruta</w:t>
             </w:r>
             <w:proofErr w:type="spellEnd"/>
@@ -4144,7 +4289,6 @@
                 <w:sz w:val="18"/>
                 <w:szCs w:val="18"/>
               </w:rPr>
-              <w:lastRenderedPageBreak/>
               <w:t>Maow</w:t>
             </w:r>
             <w:proofErr w:type="spellEnd"/>
@@ -4516,6 +4660,114 @@
         </w:tabs>
         <w:ind w:right="652"/>
       </w:pPr>
+    </w:p>
+    <w:p>
+      <w:pPr>
+        <w:pStyle w:val="ListParagraph"/>
+        <w:tabs>
+          <w:tab w:val="left" w:pos="10206"/>
+        </w:tabs>
+        <w:ind w:right="652"/>
+      </w:pPr>
+    </w:p>
+    <w:p>
+      <w:pPr>
+        <w:pStyle w:val="ListParagraph"/>
+        <w:tabs>
+          <w:tab w:val="left" w:pos="10206"/>
+        </w:tabs>
+        <w:ind w:right="652"/>
+      </w:pPr>
+    </w:p>
+    <w:p>
+      <w:pPr>
+        <w:pStyle w:val="ListParagraph"/>
+        <w:tabs>
+          <w:tab w:val="left" w:pos="10206"/>
+        </w:tabs>
+        <w:ind w:right="652"/>
+      </w:pPr>
+    </w:p>
+    <w:p>
+      <w:pPr>
+        <w:pStyle w:val="ListParagraph"/>
+        <w:tabs>
+          <w:tab w:val="left" w:pos="10206"/>
+        </w:tabs>
+        <w:ind w:right="652"/>
+      </w:pPr>
+    </w:p>
+    <w:p>
+      <w:pPr>
+        <w:pStyle w:val="ListParagraph"/>
+        <w:tabs>
+          <w:tab w:val="left" w:pos="10206"/>
+        </w:tabs>
+        <w:ind w:right="652"/>
+      </w:pPr>
+    </w:p>
+    <w:p>
+      <w:pPr>
+        <w:pStyle w:val="ListParagraph"/>
+        <w:tabs>
+          <w:tab w:val="left" w:pos="10206"/>
+        </w:tabs>
+        <w:ind w:right="652"/>
+      </w:pPr>
+    </w:p>
+    <w:p>
+      <w:pPr>
+        <w:pStyle w:val="ListParagraph"/>
+        <w:tabs>
+          <w:tab w:val="left" w:pos="10206"/>
+        </w:tabs>
+        <w:ind w:right="652"/>
+      </w:pPr>
+    </w:p>
+    <w:p>
+      <w:pPr>
+        <w:pStyle w:val="ListParagraph"/>
+        <w:tabs>
+          <w:tab w:val="left" w:pos="10206"/>
+        </w:tabs>
+        <w:ind w:right="652"/>
+      </w:pPr>
+    </w:p>
+    <w:p>
+      <w:pPr>
+        <w:pStyle w:val="ListParagraph"/>
+        <w:tabs>
+          <w:tab w:val="left" w:pos="10206"/>
+        </w:tabs>
+        <w:ind w:right="652"/>
+      </w:pPr>
+    </w:p>
+    <w:p>
+      <w:pPr>
+        <w:pStyle w:val="ListParagraph"/>
+        <w:tabs>
+          <w:tab w:val="left" w:pos="10206"/>
+        </w:tabs>
+        <w:ind w:right="652"/>
+      </w:pPr>
+    </w:p>
+    <w:p>
+      <w:pPr>
+        <w:pStyle w:val="ListParagraph"/>
+        <w:tabs>
+          <w:tab w:val="left" w:pos="10206"/>
+        </w:tabs>
+        <w:ind w:right="652"/>
+      </w:pPr>
+    </w:p>
+    <w:p>
+      <w:pPr>
+        <w:pStyle w:val="ListParagraph"/>
+        <w:tabs>
+          <w:tab w:val="left" w:pos="10206"/>
+        </w:tabs>
+        <w:ind w:right="652"/>
+      </w:pPr>
       <w:r>
         <w:t>Should you require any further clarification or wish to verify the status of this applicant’s case, please do not hesitate to contact our offices.</w:t>
       </w:r>
@@ -4528,6 +4780,15 @@
         </w:tabs>
         <w:ind w:right="652"/>
       </w:pPr>
+    </w:p>
+    <w:p>
+      <w:pPr>
+        <w:pStyle w:val="ListParagraph"/>
+        <w:tabs>
+          <w:tab w:val="left" w:pos="10206"/>
+        </w:tabs>
+        <w:ind w:right="652"/>
+      </w:pPr>
       <w:r>
         <w:t xml:space="preserve">Our </w:t>
       </w:r>
@@ -4539,13 +4800,11 @@
       <w:r>
         <w:t xml:space="preserve"> </w:t>
       </w:r>
-      <w:proofErr w:type="spellStart"/>
-      <w:r>
-        <w:t>ction</w:t>
-      </w:r>
-      <w:proofErr w:type="spellEnd"/>
-      <w:r>
-        <w:t xml:space="preserve"> has triggered the full and immediate protection of the Refugees Act. </w:t>
+      <w:r>
+        <w:t>a</w:t>
+      </w:r>
+      <w:r>
+        <w:t xml:space="preserve">ction has triggered the full and immediate protection of the Refugees Act. </w:t>
       </w:r>
       <w:r>
         <w:t xml:space="preserve">It means our client </w:t>
@@ -4571,11 +4830,12 @@
         </w:tabs>
         <w:ind w:right="652"/>
       </w:pPr>
-      <w:proofErr w:type="spellStart"/>
       <w:r>
         <w:t>Ou</w:t>
       </w:r>
-      <w:proofErr w:type="spellEnd"/>
+      <w:r>
+        <w:t>r</w:t>
+      </w:r>
       <w:r>
         <w:t xml:space="preserve"> client </w:t>
       </w:r>
@@ -4984,6 +5244,8 @@
         <w:spacing w:before="241"/>
         <w:ind w:right="652"/>
       </w:pPr>
+      <w:bookmarkStart w:id="0" w:name="_GoBack"/>
+      <w:bookmarkEnd w:id="0"/>
     </w:p>
     <w:p>
       <w:pPr>
@@ -5835,7 +6097,7 @@
             </wp:anchor>
           </w:drawing>
         </mc:Choice>
-        <mc:Fallback xmlns:w16se="http://schemas.microsoft.com/office/word/2015/wordml/symex" xmlns:w16sdtfl="http://schemas.microsoft.com/office/word/2024/wordml/sdtformatlock" xmlns:w16sdtdh="http://schemas.microsoft.com/office/word/2020/wordml/sdtdatahash" xmlns:w16du="http://schemas.microsoft.com/office/word/2023/wordml/word16du" xmlns:w16="http://schemas.microsoft.com/office/word/2018/wordml" xmlns:w16cid="http://schemas.microsoft.com/office/word/2016/wordml/cid" xmlns:w16cex="http://schemas.microsoft.com/office/word/2018/wordml/cex" xmlns:w15="http://schemas.microsoft.com/office/word/2012/wordml" xmlns:oel="http://schemas.microsoft.com/office/2019/extlst" xmlns:am3d="http://schemas.microsoft.com/office/drawing/2017/model3d" xmlns:aink="http://schemas.microsoft.com/office/drawing/2016/ink" xmlns:cx8="http://schemas.microsoft.com/office/drawing/2016/5/14/chartex" xmlns:cx7="http://schemas.microsoft.com/office/drawing/2016/5/13/chartex" xmlns:cx6="http://schemas.microsoft.com/office/drawing/2016/5/12/chartex" xmlns:cx5="http://schemas.microsoft.com/office/drawing/2016/5/11/chartex" xmlns:cx4="http://schemas.microsoft.com/office/drawing/2016/5/10/chartex" xmlns:cx3="http://schemas.microsoft.com/office/drawing/2016/5/9/chartex" xmlns:cx2="http://schemas.microsoft.com/office/drawing/2015/10/21/chartex" xmlns:cx1="http://schemas.microsoft.com/office/drawing/2015/9/8/chartex" xmlns:cx="http://schemas.microsoft.com/office/drawing/2014/chartex">
+        <mc:Fallback xmlns:cx="http://schemas.microsoft.com/office/drawing/2014/chartex" xmlns:cx1="http://schemas.microsoft.com/office/drawing/2015/9/8/chartex" xmlns:cx2="http://schemas.microsoft.com/office/drawing/2015/10/21/chartex" xmlns:cx3="http://schemas.microsoft.com/office/drawing/2016/5/9/chartex" xmlns:cx4="http://schemas.microsoft.com/office/drawing/2016/5/10/chartex" xmlns:cx5="http://schemas.microsoft.com/office/drawing/2016/5/11/chartex" xmlns:cx6="http://schemas.microsoft.com/office/drawing/2016/5/12/chartex" xmlns:cx7="http://schemas.microsoft.com/office/drawing/2016/5/13/chartex" xmlns:cx8="http://schemas.microsoft.com/office/drawing/2016/5/14/chartex" xmlns:aink="http://schemas.microsoft.com/office/drawing/2016/ink" xmlns:am3d="http://schemas.microsoft.com/office/drawing/2017/model3d" xmlns:oel="http://schemas.microsoft.com/office/2019/extlst" xmlns:w15="http://schemas.microsoft.com/office/word/2012/wordml" xmlns:w16cex="http://schemas.microsoft.com/office/word/2018/wordml/cex" xmlns:w16cid="http://schemas.microsoft.com/office/word/2016/wordml/cid" xmlns:w16="http://schemas.microsoft.com/office/word/2018/wordml" xmlns:w16du="http://schemas.microsoft.com/office/word/2023/wordml/word16du" xmlns:w16sdtdh="http://schemas.microsoft.com/office/word/2020/wordml/sdtdatahash" xmlns:w16sdtfl="http://schemas.microsoft.com/office/word/2024/wordml/sdtformatlock" xmlns:w16se="http://schemas.microsoft.com/office/word/2015/wordml/symex">
           <w:pict>
             <v:shapetype w14:anchorId="5A0EB684" id="_x0000_t202" coordsize="21600,21600" o:spt="202" path="m,l,21600r21600,l21600,xe">
               <v:stroke joinstyle="miter"/>
@@ -7010,7 +7272,7 @@
             </wp:anchor>
           </w:drawing>
         </mc:Choice>
-        <mc:Fallback xmlns:w16se="http://schemas.microsoft.com/office/word/2015/wordml/symex" xmlns:w16sdtfl="http://schemas.microsoft.com/office/word/2024/wordml/sdtformatlock" xmlns:w16sdtdh="http://schemas.microsoft.com/office/word/2020/wordml/sdtdatahash" xmlns:w16du="http://schemas.microsoft.com/office/word/2023/wordml/word16du" xmlns:w16="http://schemas.microsoft.com/office/word/2018/wordml" xmlns:w16cid="http://schemas.microsoft.com/office/word/2016/wordml/cid" xmlns:w16cex="http://schemas.microsoft.com/office/word/2018/wordml/cex" xmlns:w15="http://schemas.microsoft.com/office/word/2012/wordml" xmlns:oel="http://schemas.microsoft.com/office/2019/extlst" xmlns:am3d="http://schemas.microsoft.com/office/drawing/2017/model3d" xmlns:aink="http://schemas.microsoft.com/office/drawing/2016/ink" xmlns:cx8="http://schemas.microsoft.com/office/drawing/2016/5/14/chartex" xmlns:cx7="http://schemas.microsoft.com/office/drawing/2016/5/13/chartex" xmlns:cx6="http://schemas.microsoft.com/office/drawing/2016/5/12/chartex" xmlns:cx5="http://schemas.microsoft.com/office/drawing/2016/5/11/chartex" xmlns:cx4="http://schemas.microsoft.com/office/drawing/2016/5/10/chartex" xmlns:cx3="http://schemas.microsoft.com/office/drawing/2016/5/9/chartex" xmlns:cx2="http://schemas.microsoft.com/office/drawing/2015/10/21/chartex" xmlns:cx1="http://schemas.microsoft.com/office/drawing/2015/9/8/chartex" xmlns:cx="http://schemas.microsoft.com/office/drawing/2014/chartex">
+        <mc:Fallback xmlns:cx="http://schemas.microsoft.com/office/drawing/2014/chartex" xmlns:cx1="http://schemas.microsoft.com/office/drawing/2015/9/8/chartex" xmlns:cx2="http://schemas.microsoft.com/office/drawing/2015/10/21/chartex" xmlns:cx3="http://schemas.microsoft.com/office/drawing/2016/5/9/chartex" xmlns:cx4="http://schemas.microsoft.com/office/drawing/2016/5/10/chartex" xmlns:cx5="http://schemas.microsoft.com/office/drawing/2016/5/11/chartex" xmlns:cx6="http://schemas.microsoft.com/office/drawing/2016/5/12/chartex" xmlns:cx7="http://schemas.microsoft.com/office/drawing/2016/5/13/chartex" xmlns:cx8="http://schemas.microsoft.com/office/drawing/2016/5/14/chartex" xmlns:aink="http://schemas.microsoft.com/office/drawing/2016/ink" xmlns:am3d="http://schemas.microsoft.com/office/drawing/2017/model3d" xmlns:oel="http://schemas.microsoft.com/office/2019/extlst" xmlns:w15="http://schemas.microsoft.com/office/word/2012/wordml" xmlns:w16cex="http://schemas.microsoft.com/office/word/2018/wordml/cex" xmlns:w16cid="http://schemas.microsoft.com/office/word/2016/wordml/cid" xmlns:w16="http://schemas.microsoft.com/office/word/2018/wordml" xmlns:w16du="http://schemas.microsoft.com/office/word/2023/wordml/word16du" xmlns:w16sdtdh="http://schemas.microsoft.com/office/word/2020/wordml/sdtdatahash" xmlns:w16sdtfl="http://schemas.microsoft.com/office/word/2024/wordml/sdtformatlock" xmlns:w16se="http://schemas.microsoft.com/office/word/2015/wordml/symex">
           <w:pict>
             <v:shape w14:anchorId="2D09DB90" id="Textbox 5" o:spid="_x0000_s1027" type="#_x0000_t202" style="position:absolute;margin-left:354.4pt;margin-top:735.65pt;width:217pt;height:22.65pt;z-index:-15834112;visibility:visible;mso-wrap-style:square;mso-wrap-distance-left:0;mso-wrap-distance-top:0;mso-wrap-distance-right:0;mso-wrap-distance-bottom:0;mso-position-horizontal:absolute;mso-position-horizontal-relative:page;mso-position-vertical:absolute;mso-position-vertical-relative:page;v-text-anchor:top" o:gfxdata="UEsDBBQABgAIAAAAIQC2gziS/gAAAOEBAAATAAAAW0NvbnRlbnRfVHlwZXNdLnhtbJSRQU7DMBBF&#10;90jcwfIWJU67QAgl6YK0S0CoHGBkTxKLZGx5TGhvj5O2G0SRWNoz/78nu9wcxkFMGNg6quQqL6RA&#10;0s5Y6ir5vt9lD1JwBDIwOMJKHpHlpr69KfdHjyxSmriSfYz+USnWPY7AufNIadK6MEJMx9ApD/oD&#10;OlTrorhX2lFEilmcO2RdNtjC5xDF9pCuTyYBB5bi6bQ4syoJ3g9WQ0ymaiLzg5KdCXlKLjvcW893&#10;SUOqXwnz5DrgnHtJTxOsQfEKIT7DmDSUCaxw7Rqn8787ZsmRM9e2VmPeBN4uqYvTtW7jvijg9N/y&#10;JsXecLq0q+WD6m8AAAD//wMAUEsDBBQABgAIAAAAIQA4/SH/1gAAAJQBAAALAAAAX3JlbHMvLnJl&#10;bHOkkMFqwzAMhu+DvYPRfXGawxijTi+j0GvpHsDYimMaW0Yy2fr2M4PBMnrbUb/Q94l/f/hMi1qR&#10;JVI2sOt6UJgd+ZiDgffL8ekFlFSbvV0oo4EbChzGx4f9GRdb25HMsYhqlCwG5lrLq9biZkxWOiqY&#10;22YiTra2kYMu1l1tQD30/bPm3wwYN0x18gb45AdQl1tp5j/sFB2T0FQ7R0nTNEV3j6o9feQzro1i&#10;OWA14Fm+Q8a1a8+Bvu/d/dMb2JY5uiPbhG/ktn4cqGU/er3pcvwCAAD//wMAUEsDBBQABgAIAAAA&#10;IQAzxIzemAEAACIDAAAOAAAAZHJzL2Uyb0RvYy54bWysUsGO0zAQvSPxD5bvNNlK3V2ipitgBUJa&#10;AdIuH+A6dmMRe8yM26R/z9hNWwQ3xMUez4yf33vj9cPkB3EwSA5CK28WtRQmaOhc2LXy+8vHN/dS&#10;UFKhUwME08qjIfmwef1qPcbGLKGHoTMoGCRQM8ZW9inFpqpI98YrWkA0gYsW0KvER9xVHaqR0f1Q&#10;Lev6thoBu4igDRFnH09FuSn41hqdvlpLJomhlcwtlRXLus1rtVmrZocq9k7PNNQ/sPDKBX70AvWo&#10;khJ7dH9BeacRCGxaaPAVWOu0KRpYzU39h5rnXkVTtLA5FC820f+D1V8Oz/EbijS9h4kHWERQfAL9&#10;g9ibaozUzD3ZU2qIu7PQyaLPO0sQfJG9PV78NFMSmpPLu9Xqbc0lzbXl/d3tapUNr663I1L6ZMCL&#10;HLQSeV6FgTo8UTq1nltmMqf3M5M0bSfhukyaO3NmC92RtYw8zlbSz71CI8XwObBfefbnAM/B9hxg&#10;Gj5A+SFZUoB3+wTWFQJX3JkAD6JImD9NnvTv59J1/dqbXwAAAP//AwBQSwMEFAAGAAgAAAAhAKMO&#10;yVniAAAADgEAAA8AAABkcnMvZG93bnJldi54bWxMj8FOwzAQRO9I/IO1SNyonbakJcSpqgpOSIg0&#10;HDg6sZtYjdchdtvw92xPcNvdGc2+yTeT69nZjMF6lJDMBDCDjdcWWwmf1evDGliICrXqPRoJPybA&#10;pri9yVWm/QVLc97HllEIhkxJ6GIcMs5D0xmnwswPBkk7+NGpSOvYcj2qC4W7ns+FSLlTFulDpwaz&#10;60xz3J+chO0Xli/2+73+KA+lraongW/pUcr7u2n7DCyaKf6Z4YpP6FAQU+1PqAPrJazEmtAjCctV&#10;sgB2tSTLOd1qmh6TNAVe5Px/jeIXAAD//wMAUEsBAi0AFAAGAAgAAAAhALaDOJL+AAAA4QEAABMA&#10;AAAAAAAAAAAAAAAAAAAAAFtDb250ZW50X1R5cGVzXS54bWxQSwECLQAUAAYACAAAACEAOP0h/9YA&#10;AACUAQAACwAAAAAAAAAAAAAAAAAvAQAAX3JlbHMvLnJlbHNQSwECLQAUAAYACAAAACEAM8SM3pgB&#10;AAAiAwAADgAAAAAAAAAAAAAAAAAuAgAAZHJzL2Uyb0RvYy54bWxQSwECLQAUAAYACAAAACEAow7J&#10;WeIAAAAOAQAADwAAAAAAAAAAAAAAAADyAwAAZHJzL2Rvd25yZXYueG1sUEsFBgAAAAAEAAQA8wAA&#10;AAEFAAAAAA==&#10;" filled="f" stroked="f">
               <v:textbox inset="0,0,0,0">
@@ -7699,7 +7961,7 @@
             </wp:anchor>
           </w:drawing>
         </mc:Choice>
-        <mc:Fallback xmlns:w16se="http://schemas.microsoft.com/office/word/2015/wordml/symex" xmlns:w16sdtfl="http://schemas.microsoft.com/office/word/2024/wordml/sdtformatlock" xmlns:w16sdtdh="http://schemas.microsoft.com/office/word/2020/wordml/sdtdatahash" xmlns:w16du="http://schemas.microsoft.com/office/word/2023/wordml/word16du" xmlns:w16="http://schemas.microsoft.com/office/word/2018/wordml" xmlns:w16cid="http://schemas.microsoft.com/office/word/2016/wordml/cid" xmlns:w16cex="http://schemas.microsoft.com/office/word/2018/wordml/cex" xmlns:w15="http://schemas.microsoft.com/office/word/2012/wordml" xmlns:oel="http://schemas.microsoft.com/office/2019/extlst" xmlns:am3d="http://schemas.microsoft.com/office/drawing/2017/model3d" xmlns:aink="http://schemas.microsoft.com/office/drawing/2016/ink" xmlns:cx8="http://schemas.microsoft.com/office/drawing/2016/5/14/chartex" xmlns:cx7="http://schemas.microsoft.com/office/drawing/2016/5/13/chartex" xmlns:cx6="http://schemas.microsoft.com/office/drawing/2016/5/12/chartex" xmlns:cx5="http://schemas.microsoft.com/office/drawing/2016/5/11/chartex" xmlns:cx4="http://schemas.microsoft.com/office/drawing/2016/5/10/chartex" xmlns:cx3="http://schemas.microsoft.com/office/drawing/2016/5/9/chartex" xmlns:cx2="http://schemas.microsoft.com/office/drawing/2015/10/21/chartex" xmlns:cx1="http://schemas.microsoft.com/office/drawing/2015/9/8/chartex" xmlns:cx="http://schemas.microsoft.com/office/drawing/2014/chartex">
+        <mc:Fallback xmlns:cx="http://schemas.microsoft.com/office/drawing/2014/chartex" xmlns:cx1="http://schemas.microsoft.com/office/drawing/2015/9/8/chartex" xmlns:cx2="http://schemas.microsoft.com/office/drawing/2015/10/21/chartex" xmlns:cx3="http://schemas.microsoft.com/office/drawing/2016/5/9/chartex" xmlns:cx4="http://schemas.microsoft.com/office/drawing/2016/5/10/chartex" xmlns:cx5="http://schemas.microsoft.com/office/drawing/2016/5/11/chartex" xmlns:cx6="http://schemas.microsoft.com/office/drawing/2016/5/12/chartex" xmlns:cx7="http://schemas.microsoft.com/office/drawing/2016/5/13/chartex" xmlns:cx8="http://schemas.microsoft.com/office/drawing/2016/5/14/chartex" xmlns:aink="http://schemas.microsoft.com/office/drawing/2016/ink" xmlns:am3d="http://schemas.microsoft.com/office/drawing/2017/model3d" xmlns:oel="http://schemas.microsoft.com/office/2019/extlst" xmlns:w15="http://schemas.microsoft.com/office/word/2012/wordml" xmlns:w16cex="http://schemas.microsoft.com/office/word/2018/wordml/cex" xmlns:w16cid="http://schemas.microsoft.com/office/word/2016/wordml/cid" xmlns:w16="http://schemas.microsoft.com/office/word/2018/wordml" xmlns:w16du="http://schemas.microsoft.com/office/word/2023/wordml/word16du" xmlns:w16sdtdh="http://schemas.microsoft.com/office/word/2020/wordml/sdtdatahash" xmlns:w16sdtfl="http://schemas.microsoft.com/office/word/2024/wordml/sdtformatlock" xmlns:w16se="http://schemas.microsoft.com/office/word/2015/wordml/symex">
           <w:pict>
             <v:shape w14:anchorId="0DF5C3EF" id="Graphic 2" o:spid="_x0000_s1026" style="position:absolute;margin-left:33.8pt;margin-top:117.5pt;width:523.7pt;height:.1pt;z-index:-15835648;visibility:visible;mso-wrap-style:square;mso-wrap-distance-left:0;mso-wrap-distance-top:0;mso-wrap-distance-right:0;mso-wrap-distance-bottom:0;mso-position-horizontal:absolute;mso-position-horizontal-relative:page;mso-position-vertical:absolute;mso-position-vertical-relative:page;v-text-anchor:top" coordsize="6650990,1270" o:gfxdata="UEsDBBQABgAIAAAAIQC2gziS/gAAAOEBAAATAAAAW0NvbnRlbnRfVHlwZXNdLnhtbJSRQU7DMBBF&#10;90jcwfIWJU67QAgl6YK0S0CoHGBkTxKLZGx5TGhvj5O2G0SRWNoz/78nu9wcxkFMGNg6quQqL6RA&#10;0s5Y6ir5vt9lD1JwBDIwOMJKHpHlpr69KfdHjyxSmriSfYz+USnWPY7AufNIadK6MEJMx9ApD/oD&#10;OlTrorhX2lFEilmcO2RdNtjC5xDF9pCuTyYBB5bi6bQ4syoJ3g9WQ0ymaiLzg5KdCXlKLjvcW893&#10;SUOqXwnz5DrgnHtJTxOsQfEKIT7DmDSUCaxw7Rqn8787ZsmRM9e2VmPeBN4uqYvTtW7jvijg9N/y&#10;JsXecLq0q+WD6m8AAAD//wMAUEsDBBQABgAIAAAAIQA4/SH/1gAAAJQBAAALAAAAX3JlbHMvLnJl&#10;bHOkkMFqwzAMhu+DvYPRfXGawxijTi+j0GvpHsDYimMaW0Yy2fr2M4PBMnrbUb/Q94l/f/hMi1qR&#10;JVI2sOt6UJgd+ZiDgffL8ekFlFSbvV0oo4EbChzGx4f9GRdb25HMsYhqlCwG5lrLq9biZkxWOiqY&#10;22YiTra2kYMu1l1tQD30/bPm3wwYN0x18gb45AdQl1tp5j/sFB2T0FQ7R0nTNEV3j6o9feQzro1i&#10;OWA14Fm+Q8a1a8+Bvu/d/dMb2JY5uiPbhG/ktn4cqGU/er3pcvwCAAD//wMAUEsDBBQABgAIAAAA&#10;IQAP2zUUEQIAAF0EAAAOAAAAZHJzL2Uyb0RvYy54bWysVE1v2zAMvQ/YfxB0X+wEW7oacYqhQYcB&#10;RVegKXZWZDk2JouaqNjOvx8lfyTrbsN8EEjxiXrko7y56xvNWuWwBpPz5SLlTBkJRW2OOX/dP3z4&#10;zBl6YQqhwaicnxXyu+37d5vOZmoFFehCOUZJDGadzXnlvc2SBGWlGoELsMpQsATXCE+uOyaFEx1l&#10;b3SyStN10oErrAOpEGl3NwT5NuYvSyX997JE5ZnOOXHzcXVxPYQ12W5EdnTCVrUcaYh/YNGI2tCl&#10;c6qd8IKdXP1XqqaWDhBKv5DQJFCWtVSxBqpmmb6p5qUSVsVaqDlo5zbh/0srn9oX++wCdbSPIH8i&#10;dSTpLGZzJDg4YvrSNQFLxFkfu3ieu6h6zyRtrtef0ttbarak2HJ1E5uciGw6K0/ovyqIeUT7iH7Q&#10;oJgsUU2W7M1kOlIyaKijhp4z0tBxRhoeBg2t8OFcIBdM1l2IhL0GWrWHGPVvmBO1S1Sba9RcylQl&#10;YQcEGeEa6tVgxKvJvi5Om8jiJv0YRwNB18VDrXVgge54uNeOtSIMZvxCHZThD5h16HcCqwGHZwzO&#10;CNRmVGoQJ8h0gOL87FhH85xz/HUSTnGmvxkamDD8k+Em4zAZzut7iE8ktohu3fc/hLMsEMi5J22f&#10;YBpHkU2yheJnbDhp4MvJQ1kHTeMUDYxGh2Y4lji+t/BIrv2IuvwVtr8BAAD//wMAUEsDBBQABgAI&#10;AAAAIQCXBIiG3wAAAAsBAAAPAAAAZHJzL2Rvd25yZXYueG1sTI/BTsMwEETvSPyDtUjcqJOgpijE&#10;qaBSbkiIthIcnXgbR8Tr1HbbwNfjcIHb7s5o9k25nszAzuh8b0lAukiAIbVW9dQJ2O/quwdgPkhS&#10;crCEAr7Qw7q6viploeyF3vC8DR2LIeQLKUCHMBac+1ajkX5hR6SoHawzMsTVdVw5eYnhZuBZkuTc&#10;yJ7iBy1H3GhsP7cnI+Blabx+rbtN7T6+nw8NHd/3q6MQtzfT0yOwgFP4M8OMH9GhikyNPZHybBCQ&#10;r/LoFJDdL2On2ZCm89T8njLgVcn/d6h+AAAA//8DAFBLAQItABQABgAIAAAAIQC2gziS/gAAAOEB&#10;AAATAAAAAAAAAAAAAAAAAAAAAABbQ29udGVudF9UeXBlc10ueG1sUEsBAi0AFAAGAAgAAAAhADj9&#10;If/WAAAAlAEAAAsAAAAAAAAAAAAAAAAALwEAAF9yZWxzLy5yZWxzUEsBAi0AFAAGAAgAAAAhAA/b&#10;NRQRAgAAXQQAAA4AAAAAAAAAAAAAAAAALgIAAGRycy9lMm9Eb2MueG1sUEsBAi0AFAAGAAgAAAAh&#10;AJcEiIbfAAAACwEAAA8AAAAAAAAAAAAAAAAAawQAAGRycy9kb3ducmV2LnhtbFBLBQYAAAAABAAE&#10;APMAAAB3BQAAAAA=&#10;" path="m,l6650990,e" filled="f" strokeweight=".18622mm">
               <v:stroke dashstyle="3 1"/>
@@ -9269,7 +9531,7 @@
 </file>
 
 <file path=customXml/itemProps1.xml><?xml version="1.0" encoding="utf-8"?>
-<ds:datastoreItem xmlns:ds="http://schemas.openxmlformats.org/officeDocument/2006/customXml" ds:itemID="{771D7BB8-0669-47E1-B39E-D0C65DE8A56B}">
+<ds:datastoreItem xmlns:ds="http://schemas.openxmlformats.org/officeDocument/2006/customXml" ds:itemID="{CEACFE10-03CE-48DC-A4B9-FF007425CD33}">
   <ds:schemaRefs>
     <ds:schemaRef ds:uri="http://schemas.openxmlformats.org/officeDocument/2006/bibliography"/>
   </ds:schemaRefs>

</xml_diff>